<commit_message>
Add highlighted-changes docx and update v14 to final verified state
- AIS_MDD_manuscript_v14_highlighted_changes.docx: v13→v14 diff
  with yellow highlight (added/modified) and red strikethrough
  [DELETED: …] (removed text); 20 paragraphs + 10 table cells marked
- generate_highlighted_changes.py: reproducible diff generator
  (similarity threshold 0.999 — flags any single-char change)
- AIS_MDD_manuscript_v14.docx: re-staged at fully verified state
  (all 13 key corrections confirmed present, 0 regressions)

Co-Authored-By: Claude Sonnet 4.6 <noreply@anthropic.com>
</commit_message>
<xml_diff>
--- a/AIS_MDD_manuscript_v14.docx
+++ b/AIS_MDD_manuscript_v14.docx
@@ -351,25 +351,6 @@
           <w:szCs w:val="24"/>
         </w:rPr>
         <w:t>Highlights</w:t>
-      </w:r>
-    </w:p>
-    <w:p>
-      <w:pPr>
-        <w:pStyle w:val="Normal"/>
-        <w:spacing w:lineRule="auto" w:line="360"/>
-        <w:jc w:val="both"/>
-        <w:rPr/>
-      </w:pPr>
-      <w:r>
-        <w:rPr>
-          <w:rFonts w:eastAsia="Times New Roman" w:cs="Times New Roman"/>
-          <w:i/>
-          <w:iCs/>
-          <w:color w:val="888888"/>
-          <w:sz w:val="24"/>
-          <w:szCs w:val="24"/>
-        </w:rPr>
-        <w:t>(Submit as separate file. Max 85 characters per bullet.)</w:t>
       </w:r>
     </w:p>
     <w:p>
@@ -547,7 +528,17 @@
           <w:sz w:val="24"/>
           <w:szCs w:val="24"/>
         </w:rPr>
-        <w:t>Methods: Three primary EEG datasets (total N = 412 unique participants across all five datasets) were analyzed: (1) a probabilistic selection task (109 participants: 86 healthy controls [HC], 23 MDD); (2) resting-state EEG from the same cohort (N=113); and (3) a clinical resting-state dataset (N=168). AIS was estimated using bin-based Shannon mutual information.</w:t>
+        <w:t xml:space="preserve">Methods: </w:t>
+      </w:r>
+      <w:r>
+        <w:rPr>
+          <w:rFonts w:eastAsia="Times New Roman" w:cs="Times New Roman" w:ascii="Times New Roman" w:hAnsi="Times New Roman"/>
+          <w:b w:val="false"/>
+          <w:bCs w:val="false"/>
+          <w:sz w:val="24"/>
+          <w:szCs w:val="24"/>
+        </w:rPr>
+        <w:t>Three primary EEG datasets (total N = 412 unique participants across all five datasets) were analyzed: (1) a probabilistic selection task (109 participants: 86 healthy controls [HC], 23 MDD); (2) resting-state EEG from the same cohort (N=113); and (3) a clinical resting-state dataset (N=168). AIS was estimated using bin-based Shannon mutual information.</w:t>
       </w:r>
     </w:p>
     <w:p>
@@ -558,7 +549,14 @@
       </w:pPr>
       <w:r>
         <w:rPr/>
-        <w:t>Results: HC showed significantly higher AIS than MDD during reward anticipation (d = 0.81, p &lt; .001) and resting state (d = 0.70, p = .003; d = 0.53, p=.006). A fourth resting-state dataset (N=53) showed the same directional pattern (d = 0.32) but was underpowered. The task effect was specific to reward-contingent contexts. Exploratory analysis found AIS was lower in partially remitted than currently depressed MDD (d = 0.96, p = .034), independent of residual symptom severity (ANCOVA, p = .033, partial η²=0.21).</w:t>
+        <w:t xml:space="preserve">Results: </w:t>
+      </w:r>
+      <w:r>
+        <w:rPr>
+          <w:b w:val="false"/>
+          <w:bCs w:val="false"/>
+        </w:rPr>
+        <w:t>HC showed significantly higher AIS than MDD during reward anticipation (d = 0.81, p &lt; .001) and resting state (d = 0.70, p = .003; d = 0.53, p=.006). A fourth resting-state dataset (N=53) showed the same directional pattern (d = 0.32) but was underpowered. The task effect was specific to reward-contingent contexts. Exploratory analysis found AIS was lower in partially remitted than currently depressed MDD (d = 0.96, p = .034), independent of residual symptom severity (ANCOVA, p = .033, partial η²=0.21).</w:t>
       </w:r>
     </w:p>
     <w:p>

</xml_diff>